<commit_message>
Consolidate generators and prep repo for public release
- Merge create_cv_{de,en,es,pt}.js into one create_cv.js <lang> [--personal];
  fixes the header drift (standardized on the shared layout) and drops the
  dead skills-bullets numbering config
- Add MIT LICENSE (code only; CV content + twiceD branding reserved) and flesh
  out package.json (name/version/description/private)
- Remove unused sharp dependency and refresh the lockfile
- Point the project-overview link at danieldeusing.de (was an internal
  *.workers.dev preview URL)
- generate_all.sh: single generator + guard when soffice is missing
- Update CLAUDE.md, README, and the generators rule for the single script
- Regenerate all 8 DOCX + PDFs
</commit_message>
<xml_diff>
--- a/Daniel_Deusing_DE.docx
+++ b/Daniel_Deusing_DE.docx
@@ -4,7 +4,7 @@
   <w:body>
     <w:tbl>
       <w:tblPr>
-        <w:tblW w:type="pct" w:w="100%"/>
+        <w:tblW w:type="auto" w:w="100"/>
         <w:tblBorders>
           <w:top w:val="single" w:color="auto" w:sz="4"/>
           <w:left w:val="single" w:color="auto" w:sz="4"/>
@@ -15,20 +15,20 @@
         </w:tblBorders>
       </w:tblPr>
       <w:tblGrid>
-        <w:gridCol w:w="6000"/>
-        <w:gridCol w:w="4000"/>
+        <w:gridCol w:w="6500"/>
+        <w:gridCol w:w="3500"/>
       </w:tblGrid>
       <w:tr>
         <w:tc>
           <w:tcPr>
-            <w:tcW w:type="dxa" w:w="6000"/>
-            <w:tcBorders>
-              <w:top w:val="none" w:color="FFFFFF" w:sz="0"/>
-              <w:left w:val="none" w:color="FFFFFF" w:sz="0"/>
-              <w:bottom w:val="none" w:color="FFFFFF" w:sz="0"/>
-              <w:right w:val="none" w:color="FFFFFF" w:sz="0"/>
-            </w:tcBorders>
-            <w:vAlign w:val="top"/>
+            <w:tcW w:type="dxa" w:w="6500"/>
+            <w:tcBorders>
+              <w:top w:val="none" w:color="FFFFFF" w:sz="0"/>
+              <w:left w:val="none" w:color="FFFFFF" w:sz="0"/>
+              <w:bottom w:val="none" w:color="FFFFFF" w:sz="0"/>
+              <w:right w:val="none" w:color="FFFFFF" w:sz="0"/>
+            </w:tcBorders>
+            <w:vAlign w:val="center"/>
           </w:tcPr>
           <w:p>
             <w:pPr>
@@ -108,7 +108,7 @@
               </w:rPr>
               <w:t xml:space="preserve"> </w:t>
             </w:r>
-            <w:hyperlink w:history="1" r:id="rId3sc7qtvkxhrmegglid5jr">
+            <w:hyperlink w:history="1" r:id="rIdpg-ilq5ozgfihjon4mn6g">
               <w:r>
                 <w:rPr>
                   <w:rFonts w:ascii="Nunito" w:cs="Nunito" w:eastAsia="Nunito" w:hAnsi="Nunito"/>
@@ -175,7 +175,7 @@
               </w:rPr>
               <w:t xml:space="preserve"> </w:t>
             </w:r>
-            <w:hyperlink w:history="1" r:id="rIdjeofoss1vxkvmzybejick">
+            <w:hyperlink w:history="1" r:id="rIdbd_qwtld4xzva3inm3ew2">
               <w:r>
                 <w:rPr>
                   <w:rFonts w:ascii="Nunito" w:cs="Nunito" w:eastAsia="Nunito" w:hAnsi="Nunito"/>
@@ -242,7 +242,7 @@
               </w:rPr>
               <w:t xml:space="preserve"> </w:t>
             </w:r>
-            <w:hyperlink w:history="1" r:id="rIdwx_xobdk_cz3hrmybvrtr">
+            <w:hyperlink w:history="1" r:id="rIdlnjc8wi84xkayqak4e_lk">
               <w:r>
                 <w:rPr>
                   <w:rFonts w:ascii="Nunito" w:cs="Nunito" w:eastAsia="Nunito" w:hAnsi="Nunito"/>
@@ -257,7 +257,7 @@
         </w:tc>
         <w:tc>
           <w:tcPr>
-            <w:tcW w:type="dxa" w:w="4000"/>
+            <w:tcW w:type="dxa" w:w="3500"/>
             <w:tcBorders>
               <w:top w:val="none" w:color="FFFFFF" w:sz="0"/>
               <w:left w:val="none" w:color="FFFFFF" w:sz="0"/>
@@ -299,13 +299,105 @@
           <w:b/>
           <w:bCs/>
         </w:rPr>
-        <w:t xml:space="preserve">über 13 Jahren Erfahrung</w:t>
+        <w:t xml:space="preserve">über 15 Jahren Erfahrung</w:t>
       </w:r>
       <w:r>
         <w:rPr>
           <w:rFonts w:ascii="Nunito" w:cs="Nunito" w:eastAsia="Nunito" w:hAnsi="Nunito"/>
         </w:rPr>
         <w:t xml:space="preserve"> in Full-Stack-Entwicklung, IoT, Embedded Systems und Enterprise-Software. Nachgewiesene Erfolge in der Leitung von Entwicklungsteams und Bereitstellung missionskritischer Systeme für Automobil-, Verteidigungs- und Industriekunden. Stark im systematischen Debugging und der Root-Cause-Analyse komplexer Probleme. Erfahren im Code-Review mit Fokus auf Wissenstransfer und Teamentwicklung. Kombiniert technische Hands-on-Expertise mit Führungskompetenz – von der Architekturplanung über die Implementierung bis zum Produktivbetrieb. Kommunikationsstark in Deutsch, Englisch und Spanisch. Erfahrung in agilen, verteilten Teams und internationalen Projekten.</w:t>
+      </w:r>
+    </w:p>
+    <w:p>
+      <w:pPr>
+        <w:pStyle w:val="SectionHeader"/>
+      </w:pPr>
+      <w:r>
+        <w:t xml:space="preserve">Kernkompetenzen</w:t>
+      </w:r>
+    </w:p>
+    <w:p>
+      <w:pPr>
+        <w:pStyle w:val="ListParagraph"/>
+        <w:numPr>
+          <w:ilvl w:val="0"/>
+          <w:numId w:val="2"/>
+        </w:numPr>
+      </w:pPr>
+      <w:r>
+        <w:rPr>
+          <w:rFonts w:ascii="Nunito" w:cs="Nunito" w:eastAsia="Nunito" w:hAnsi="Nunito"/>
+          <w:b/>
+          <w:bCs/>
+          <w:color w:val="1E3A5F"/>
+          <w:sz w:val="20"/>
+          <w:szCs w:val="20"/>
+        </w:rPr>
+        <w:t xml:space="preserve">Schnelles Debugging in der Produktion – </w:t>
+      </w:r>
+      <w:r>
+        <w:rPr>
+          <w:rFonts w:ascii="Nunito" w:cs="Nunito" w:eastAsia="Nunito" w:hAnsi="Nunito"/>
+          <w:sz w:val="20"/>
+          <w:szCs w:val="20"/>
+        </w:rPr>
+        <w:t xml:space="preserve">Als Unternehmensgründer habe ich immer wieder dringende Produktionsfehler selbst verantwortet – das schult darin, Probleme schnell einzugrenzen und zu beheben, oft in fremdem Code.</w:t>
+      </w:r>
+    </w:p>
+    <w:p>
+      <w:pPr>
+        <w:pStyle w:val="ListParagraph"/>
+        <w:numPr>
+          <w:ilvl w:val="0"/>
+          <w:numId w:val="2"/>
+        </w:numPr>
+      </w:pPr>
+      <w:r>
+        <w:rPr>
+          <w:rFonts w:ascii="Nunito" w:cs="Nunito" w:eastAsia="Nunito" w:hAnsi="Nunito"/>
+          <w:b/>
+          <w:bCs/>
+          <w:color w:val="1E3A5F"/>
+          <w:sz w:val="20"/>
+          <w:szCs w:val="20"/>
+        </w:rPr>
+        <w:t xml:space="preserve">Mentoring &amp; beidseitiger Wissenstransfer – </w:t>
+      </w:r>
+      <w:r>
+        <w:rPr>
+          <w:rFonts w:ascii="Nunito" w:cs="Nunito" w:eastAsia="Nunito" w:hAnsi="Nunito"/>
+          <w:sz w:val="20"/>
+          <w:szCs w:val="20"/>
+        </w:rPr>
+        <w:t xml:space="preserve">Ich gebe mein Wissen gerne an junge Entwickler weiter – und schätze, wie viel auch erfahrene Entwickler von der frischen Sichtweise der Jüngeren lernen, wenn sie nicht arrogant sind.</w:t>
+      </w:r>
+    </w:p>
+    <w:p>
+      <w:pPr>
+        <w:pStyle w:val="ListParagraph"/>
+        <w:numPr>
+          <w:ilvl w:val="0"/>
+          <w:numId w:val="2"/>
+        </w:numPr>
+      </w:pPr>
+      <w:r>
+        <w:rPr>
+          <w:rFonts w:ascii="Nunito" w:cs="Nunito" w:eastAsia="Nunito" w:hAnsi="Nunito"/>
+          <w:b/>
+          <w:bCs/>
+          <w:color w:val="1E3A5F"/>
+          <w:sz w:val="20"/>
+          <w:szCs w:val="20"/>
+        </w:rPr>
+        <w:t xml:space="preserve">KI-gestützte Entwicklung – </w:t>
+      </w:r>
+      <w:r>
+        <w:rPr>
+          <w:rFonts w:ascii="Nunito" w:cs="Nunito" w:eastAsia="Nunito" w:hAnsi="Nunito"/>
+          <w:sz w:val="20"/>
+          <w:szCs w:val="20"/>
+        </w:rPr>
+        <w:t xml:space="preserve">Seit drei Jahren tief in der Entwicklung mit KI – nicht nur das Programmieren mit KI, sondern ihre Konfiguration für hochwertige, kosteneffiziente Ergebnisse, während Architektur und Urteilsvermögen beim Menschen bleiben: Konzepte vor reiner Syntax.</w:t>
       </w:r>
     </w:p>
     <w:p>
@@ -3943,18 +4035,6 @@
       </w:pPr>
     </w:lvl>
   </w:abstractNum>
-  <w:abstractNum w:abstractNumId="3" w15:restartNumberingAfterBreak="0">
-    <w:multiLevelType w:val="hybridMultilevel"/>
-    <w:lvl w:ilvl="0" w15:tentative="1">
-      <w:start w:val="1"/>
-      <w:numFmt w:val="bullet"/>
-      <w:lvlText w:val="•"/>
-      <w:lvlJc w:val="left"/>
-      <w:pPr>
-        <w:ind w:left="360" w:hanging="200"/>
-      </w:pPr>
-    </w:lvl>
-  </w:abstractNum>
   <w:num w:numId="1">
     <w:abstractNumId w:val="1"/>
     <w:lvlOverride w:ilvl="0">
@@ -3962,7 +4042,7 @@
     </w:lvlOverride>
   </w:num>
   <w:num w:numId="2">
-    <w:abstractNumId w:val="3"/>
+    <w:abstractNumId w:val="2"/>
     <w:lvlOverride w:ilvl="0">
       <w:startOverride w:val="1"/>
     </w:lvlOverride>

</xml_diff>

<commit_message>
Profile: professional experience since 2012
Replaces the 15+ years count in all four languages; the PDF and DOCX files are rebuilt.
</commit_message>
<xml_diff>
--- a/Daniel_Deusing_DE.docx
+++ b/Daniel_Deusing_DE.docx
@@ -108,7 +108,7 @@
               </w:rPr>
               <w:t xml:space="preserve"> </w:t>
             </w:r>
-            <w:hyperlink w:history="1" r:id="rIdpg-ilq5ozgfihjon4mn6g">
+            <w:hyperlink w:history="1" r:id="rIdik94cpmz8nxwipwaswvjx">
               <w:r>
                 <w:rPr>
                   <w:rFonts w:ascii="Nunito" w:cs="Nunito" w:eastAsia="Nunito" w:hAnsi="Nunito"/>
@@ -175,7 +175,7 @@
               </w:rPr>
               <w:t xml:space="preserve"> </w:t>
             </w:r>
-            <w:hyperlink w:history="1" r:id="rIdbd_qwtld4xzva3inm3ew2">
+            <w:hyperlink w:history="1" r:id="rIdsy4g-d5zao8a9k2lrlis_">
               <w:r>
                 <w:rPr>
                   <w:rFonts w:ascii="Nunito" w:cs="Nunito" w:eastAsia="Nunito" w:hAnsi="Nunito"/>
@@ -242,7 +242,7 @@
               </w:rPr>
               <w:t xml:space="preserve"> </w:t>
             </w:r>
-            <w:hyperlink w:history="1" r:id="rIdlnjc8wi84xkayqak4e_lk">
+            <w:hyperlink w:history="1" r:id="rId9uc0n39ccsgrfdlux4n2z">
               <w:r>
                 <w:rPr>
                   <w:rFonts w:ascii="Nunito" w:cs="Nunito" w:eastAsia="Nunito" w:hAnsi="Nunito"/>
@@ -299,7 +299,7 @@
           <w:b/>
           <w:bCs/>
         </w:rPr>
-        <w:t xml:space="preserve">über 15 Jahren Erfahrung</w:t>
+        <w:t xml:space="preserve">Berufserfahrung seit 2012</w:t>
       </w:r>
       <w:r>
         <w:rPr>

</xml_diff>

<commit_message>
PDFs: embed Nunito again; LibreOffice 26.8 ignores macOS fonts
The PDFs rebuilt in 1803c0d came out in Linux Libertine and Frank Ruhl:
LibreOffice 26.8.1.1 on macOS uses only its own bundled fonts. generate_all.sh
now copies the installed Nunito into a temporary LibreOffice profile (user/fonts)
and fails if any PDF does not embed Nunito (pdffonts).

- Rebuild all 8 DOCX + PDFs; re-render the README preview animation
- README and CLAUDE.md name the new requirements (poppler, Nunito installed)
</commit_message>
<xml_diff>
--- a/Daniel_Deusing_DE.docx
+++ b/Daniel_Deusing_DE.docx
@@ -108,7 +108,7 @@
               </w:rPr>
               <w:t xml:space="preserve"> </w:t>
             </w:r>
-            <w:hyperlink w:history="1" r:id="rIdik94cpmz8nxwipwaswvjx">
+            <w:hyperlink w:history="1" r:id="rIdfnsae0o1_mxwahb4ikawt">
               <w:r>
                 <w:rPr>
                   <w:rFonts w:ascii="Nunito" w:cs="Nunito" w:eastAsia="Nunito" w:hAnsi="Nunito"/>
@@ -175,7 +175,7 @@
               </w:rPr>
               <w:t xml:space="preserve"> </w:t>
             </w:r>
-            <w:hyperlink w:history="1" r:id="rIdsy4g-d5zao8a9k2lrlis_">
+            <w:hyperlink w:history="1" r:id="rIdx6iyiq0xklrfzpwmx3pou">
               <w:r>
                 <w:rPr>
                   <w:rFonts w:ascii="Nunito" w:cs="Nunito" w:eastAsia="Nunito" w:hAnsi="Nunito"/>
@@ -242,7 +242,7 @@
               </w:rPr>
               <w:t xml:space="preserve"> </w:t>
             </w:r>
-            <w:hyperlink w:history="1" r:id="rId9uc0n39ccsgrfdlux4n2z">
+            <w:hyperlink w:history="1" r:id="rIdmkb1r4mm1busbnvbqwepq">
               <w:r>
                 <w:rPr>
                   <w:rFonts w:ascii="Nunito" w:cs="Nunito" w:eastAsia="Nunito" w:hAnsi="Nunito"/>

</xml_diff>